<commit_message>
Refresh doc template with colored header
</commit_message>
<xml_diff>
--- a/assets/docs/ncompass-reference.docx
+++ b/assets/docs/ncompass-reference.docx
@@ -2,11 +2,6 @@
 <file path=word/document.xml><?xml version="1.0" encoding="utf-8"?>
 <w:document xmlns:wpc="http://schemas.microsoft.com/office/word/2010/wordprocessingCanvas" xmlns:mo="http://schemas.microsoft.com/office/mac/office/2008/main" xmlns:mc="http://schemas.openxmlformats.org/markup-compatibility/2006" xmlns:mv="urn:schemas-microsoft-com:mac:vml" xmlns:o="urn:schemas-microsoft-com:office:office" xmlns:r="http://schemas.openxmlformats.org/officeDocument/2006/relationships" xmlns:m="http://schemas.openxmlformats.org/officeDocument/2006/math" xmlns:v="urn:schemas-microsoft-com:vml" xmlns:wp14="http://schemas.microsoft.com/office/word/2010/wordprocessingDrawing" xmlns:wp="http://schemas.openxmlformats.org/drawingml/2006/wordprocessingDrawing" xmlns:w10="urn:schemas-microsoft-com:office:word" xmlns:w="http://schemas.openxmlformats.org/wordprocessingml/2006/main" xmlns:w14="http://schemas.microsoft.com/office/word/2010/wordml" xmlns:wpg="http://schemas.microsoft.com/office/word/2010/wordprocessingGroup" xmlns:wpi="http://schemas.microsoft.com/office/word/2010/wordprocessingInk" xmlns:wne="http://schemas.microsoft.com/office/word/2006/wordml" xmlns:wps="http://schemas.microsoft.com/office/word/2010/wordprocessingShape" mc:Ignorable="w14 wp14">
   <w:body>
-    <w:p>
-      <w:r>
-        <w:t>Insert report below. Template for branding purposes.</w:t>
-      </w:r>
-    </w:p>
     <w:sectPr>
       <w:headerReference w:type="default" r:id="rId9"/>
       <w:pgSz w:w="12240" w:h="15840"/>
@@ -23,51 +18,94 @@
   <w:p>
     <w:pPr>
       <w:pStyle w:val="Header"/>
-      <w:jc w:val="right"/>
+    </w:pPr>
+  </w:p>
+  <w:tbl>
+    <w:tblPr>
+      <w:tblW w:type="auto" w:w="0"/>
+      <w:tblLayout w:type="fixed"/>
+      <w:tblLook w:firstColumn="1" w:firstRow="1" w:lastColumn="0" w:lastRow="0" w:noHBand="0" w:noVBand="1" w:val="04A0"/>
+    </w:tblPr>
+    <w:tblGrid>
+      <w:gridCol w:w="8280"/>
+      <w:gridCol w:w="8280"/>
+    </w:tblGrid>
+    <w:tr>
+      <w:tc>
+        <w:tcPr>
+          <w:tcW w:type="dxa" w:w="11232"/>
+          <w:shd w:fill="072b63"/>
+        </w:tcPr>
+        <w:p>
+          <w:pPr>
+            <w:jc w:val="left"/>
+          </w:pPr>
+          <w:r>
+            <w:rPr>
+              <w:b/>
+              <w:color w:val="FFFFFF"/>
+              <w:sz w:val="24"/>
+            </w:rPr>
+            <w:t>Digital Signage Security Report</w:t>
+          </w:r>
+        </w:p>
+      </w:tc>
+      <w:tc>
+        <w:tcPr>
+          <w:tcW w:type="dxa" w:w="8280"/>
+          <w:shd w:fill="072b63"/>
+        </w:tcPr>
+        <w:p>
+          <w:pPr>
+            <w:jc w:val="right"/>
+          </w:pPr>
+          <w:r>
+            <w:drawing>
+              <wp:inline xmlns:a="http://schemas.openxmlformats.org/drawingml/2006/main" xmlns:pic="http://schemas.openxmlformats.org/drawingml/2006/picture">
+                <wp:extent cx="2834640" cy="507135"/>
+                <wp:docPr id="1" name="Picture 1"/>
+                <wp:cNvGraphicFramePr>
+                  <a:graphicFrameLocks noChangeAspect="1"/>
+                </wp:cNvGraphicFramePr>
+                <a:graphic>
+                  <a:graphicData uri="http://schemas.openxmlformats.org/drawingml/2006/picture">
+                    <pic:pic>
+                      <pic:nvPicPr>
+                        <pic:cNvPr id="0" name="ncompass-logo.png"/>
+                        <pic:cNvPicPr/>
+                      </pic:nvPicPr>
+                      <pic:blipFill>
+                        <a:blip r:embed="rId1"/>
+                        <a:stretch>
+                          <a:fillRect/>
+                        </a:stretch>
+                      </pic:blipFill>
+                      <pic:spPr>
+                        <a:xfrm>
+                          <a:off x="0" y="0"/>
+                          <a:ext cx="2834640" cy="507135"/>
+                        </a:xfrm>
+                        <a:prstGeom prst="rect"/>
+                      </pic:spPr>
+                    </pic:pic>
+                  </a:graphicData>
+                </a:graphic>
+              </wp:inline>
+            </w:drawing>
+          </w:r>
+        </w:p>
+      </w:tc>
+    </w:tr>
+  </w:tbl>
+  <w:p>
+    <w:pPr>
+      <w:jc w:val="left"/>
     </w:pPr>
     <w:r>
-      <w:drawing>
-        <wp:inline xmlns:a="http://schemas.openxmlformats.org/drawingml/2006/main" xmlns:pic="http://schemas.openxmlformats.org/drawingml/2006/picture">
-          <wp:extent cx="2286000" cy="408980"/>
-          <wp:docPr id="1" name="Picture 1"/>
-          <wp:cNvGraphicFramePr>
-            <a:graphicFrameLocks noChangeAspect="1"/>
-          </wp:cNvGraphicFramePr>
-          <a:graphic>
-            <a:graphicData uri="http://schemas.openxmlformats.org/drawingml/2006/picture">
-              <pic:pic>
-                <pic:nvPicPr>
-                  <pic:cNvPr id="0" name="ncompass-logo.png"/>
-                  <pic:cNvPicPr/>
-                </pic:nvPicPr>
-                <pic:blipFill>
-                  <a:blip r:embed="rId1"/>
-                  <a:stretch>
-                    <a:fillRect/>
-                  </a:stretch>
-                </pic:blipFill>
-                <pic:spPr>
-                  <a:xfrm>
-                    <a:off x="0" y="0"/>
-                    <a:ext cx="2286000" cy="408980"/>
-                  </a:xfrm>
-                  <a:prstGeom prst="rect"/>
-                </pic:spPr>
-              </pic:pic>
-            </a:graphicData>
-          </a:graphic>
-        </wp:inline>
-      </w:drawing>
-    </w:r>
-  </w:p>
-  <w:p>
-    <w:pPr>
-      <w:jc w:val="left"/>
-    </w:pPr>
-    <w:r>
-      <w:rPr>
-        <w:b/>
-        <w:sz w:val="24"/>
+      <w:rPr>
+        <w:b/>
+        <w:color w:val="FFFFFF"/>
+        <w:sz w:val="20"/>
       </w:rPr>
       <w:t>N-Compass TV — Secure Fleet Report</w:t>
     </w:r>

</xml_diff>